<commit_message>
Generar reporte de permisos ext por tipo y quincena
</commit_message>
<xml_diff>
--- a/src/templates/permisosExtQuincenaTemplate.docx
+++ b/src/templates/permisosExtQuincenaTemplate.docx
@@ -544,10 +544,10 @@
       </w:tblPr>
       <w:tblGrid>
         <w:gridCol w:w="562"/>
-        <w:gridCol w:w="1560"/>
-        <w:gridCol w:w="1984"/>
         <w:gridCol w:w="1701"/>
-        <w:gridCol w:w="1134"/>
+        <w:gridCol w:w="1276"/>
+        <w:gridCol w:w="1985"/>
+        <w:gridCol w:w="1417"/>
         <w:gridCol w:w="851"/>
         <w:gridCol w:w="1417"/>
         <w:gridCol w:w="1887"/>
@@ -584,64 +584,6 @@
         </w:tc>
         <w:tc>
           <w:tcPr>
-            <w:tcW w:w="1560" w:type="dxa"/>
-            <w:shd w:val="clear" w:color="auto" w:fill="D9D9D9" w:themeFill="background1" w:themeFillShade="D9"/>
-          </w:tcPr>
-          <w:p>
-            <w:pPr>
-              <w:rPr>
-                <w:rFonts w:ascii="Montserrat" w:hAnsi="Montserrat" w:cs="Arial"/>
-                <w:b/>
-                <w:bCs/>
-                <w:sz w:val="20"/>
-                <w:szCs w:val="20"/>
-                <w:lang w:val="es-419"/>
-              </w:rPr>
-            </w:pPr>
-            <w:r>
-              <w:rPr>
-                <w:rFonts w:ascii="Montserrat" w:hAnsi="Montserrat" w:cs="Arial"/>
-                <w:b/>
-                <w:bCs/>
-                <w:sz w:val="20"/>
-                <w:szCs w:val="20"/>
-                <w:lang w:val="es-419"/>
-              </w:rPr>
-              <w:t>NOMBRE</w:t>
-            </w:r>
-          </w:p>
-        </w:tc>
-        <w:tc>
-          <w:tcPr>
-            <w:tcW w:w="1984" w:type="dxa"/>
-            <w:shd w:val="clear" w:color="auto" w:fill="D9D9D9" w:themeFill="background1" w:themeFillShade="D9"/>
-          </w:tcPr>
-          <w:p>
-            <w:pPr>
-              <w:rPr>
-                <w:rFonts w:ascii="Montserrat" w:hAnsi="Montserrat" w:cs="Arial"/>
-                <w:b/>
-                <w:bCs/>
-                <w:sz w:val="20"/>
-                <w:szCs w:val="20"/>
-                <w:lang w:val="es-419"/>
-              </w:rPr>
-            </w:pPr>
-            <w:r>
-              <w:rPr>
-                <w:rFonts w:ascii="Montserrat" w:hAnsi="Montserrat" w:cs="Arial"/>
-                <w:b/>
-                <w:bCs/>
-                <w:sz w:val="20"/>
-                <w:szCs w:val="20"/>
-                <w:lang w:val="es-419"/>
-              </w:rPr>
-              <w:t>CURP</w:t>
-            </w:r>
-          </w:p>
-        </w:tc>
-        <w:tc>
-          <w:tcPr>
             <w:tcW w:w="1701" w:type="dxa"/>
             <w:shd w:val="clear" w:color="auto" w:fill="D9D9D9" w:themeFill="background1" w:themeFillShade="D9"/>
           </w:tcPr>
@@ -665,13 +607,71 @@
                 <w:szCs w:val="20"/>
                 <w:lang w:val="es-419"/>
               </w:rPr>
+              <w:t>NOMBRE</w:t>
+            </w:r>
+          </w:p>
+        </w:tc>
+        <w:tc>
+          <w:tcPr>
+            <w:tcW w:w="1276" w:type="dxa"/>
+            <w:shd w:val="clear" w:color="auto" w:fill="D9D9D9" w:themeFill="background1" w:themeFillShade="D9"/>
+          </w:tcPr>
+          <w:p>
+            <w:pPr>
+              <w:rPr>
+                <w:rFonts w:ascii="Montserrat" w:hAnsi="Montserrat" w:cs="Arial"/>
+                <w:b/>
+                <w:bCs/>
+                <w:sz w:val="20"/>
+                <w:szCs w:val="20"/>
+                <w:lang w:val="es-419"/>
+              </w:rPr>
+            </w:pPr>
+            <w:r>
+              <w:rPr>
+                <w:rFonts w:ascii="Montserrat" w:hAnsi="Montserrat" w:cs="Arial"/>
+                <w:b/>
+                <w:bCs/>
+                <w:sz w:val="20"/>
+                <w:szCs w:val="20"/>
+                <w:lang w:val="es-419"/>
+              </w:rPr>
+              <w:t>TARJETA</w:t>
+            </w:r>
+          </w:p>
+        </w:tc>
+        <w:tc>
+          <w:tcPr>
+            <w:tcW w:w="1985" w:type="dxa"/>
+            <w:shd w:val="clear" w:color="auto" w:fill="D9D9D9" w:themeFill="background1" w:themeFillShade="D9"/>
+          </w:tcPr>
+          <w:p>
+            <w:pPr>
+              <w:rPr>
+                <w:rFonts w:ascii="Montserrat" w:hAnsi="Montserrat" w:cs="Arial"/>
+                <w:b/>
+                <w:bCs/>
+                <w:sz w:val="20"/>
+                <w:szCs w:val="20"/>
+                <w:lang w:val="es-419"/>
+              </w:rPr>
+            </w:pPr>
+            <w:r>
+              <w:rPr>
+                <w:rFonts w:ascii="Montserrat" w:hAnsi="Montserrat" w:cs="Arial"/>
+                <w:b/>
+                <w:bCs/>
+                <w:sz w:val="20"/>
+                <w:szCs w:val="20"/>
+                <w:lang w:val="es-419"/>
+              </w:rPr>
               <w:t>TIPO</w:t>
             </w:r>
           </w:p>
         </w:tc>
         <w:tc>
           <w:tcPr>
-            <w:tcW w:w="1134" w:type="dxa"/>
+            <w:tcW w:w="1417" w:type="dxa"/>
             <w:shd w:val="clear" w:color="auto" w:fill="D9D9D9" w:themeFill="background1" w:themeFillShade="D9"/>
           </w:tcPr>
           <w:p>
@@ -819,7 +819,7 @@
         </w:tc>
         <w:tc>
           <w:tcPr>
-            <w:tcW w:w="1560" w:type="dxa"/>
+            <w:tcW w:w="1701" w:type="dxa"/>
           </w:tcPr>
           <w:p>
             <w:pPr>
@@ -843,31 +843,50 @@
         </w:tc>
         <w:tc>
           <w:tcPr>
-            <w:tcW w:w="1984" w:type="dxa"/>
-          </w:tcPr>
-          <w:p>
-            <w:pPr>
-              <w:rPr>
-                <w:rFonts w:ascii="Montserrat" w:hAnsi="Montserrat" w:cs="Arial"/>
-                <w:sz w:val="20"/>
-                <w:szCs w:val="20"/>
-                <w:lang w:val="es-419"/>
-              </w:rPr>
-            </w:pPr>
-            <w:r>
-              <w:rPr>
-                <w:rFonts w:ascii="Montserrat" w:hAnsi="Montserrat" w:cs="Arial"/>
-                <w:sz w:val="20"/>
-                <w:szCs w:val="20"/>
-                <w:lang w:val="es-419"/>
-              </w:rPr>
-              <w:t>{CURP}</w:t>
-            </w:r>
-          </w:p>
-        </w:tc>
-        <w:tc>
-          <w:tcPr>
-            <w:tcW w:w="1701" w:type="dxa"/>
+            <w:tcW w:w="1276" w:type="dxa"/>
+          </w:tcPr>
+          <w:p>
+            <w:pPr>
+              <w:jc w:val="center"/>
+              <w:rPr>
+                <w:rFonts w:ascii="Montserrat" w:hAnsi="Montserrat" w:cs="Arial"/>
+                <w:sz w:val="20"/>
+                <w:szCs w:val="20"/>
+                <w:lang w:val="es-419"/>
+              </w:rPr>
+            </w:pPr>
+            <w:r>
+              <w:rPr>
+                <w:rFonts w:ascii="Montserrat" w:hAnsi="Montserrat" w:cs="Arial"/>
+                <w:sz w:val="20"/>
+                <w:szCs w:val="20"/>
+                <w:lang w:val="es-419"/>
+              </w:rPr>
+              <w:t>{</w:t>
+            </w:r>
+            <w:r>
+              <w:rPr>
+                <w:rFonts w:ascii="Montserrat" w:hAnsi="Montserrat" w:cs="Arial"/>
+                <w:sz w:val="20"/>
+                <w:szCs w:val="20"/>
+                <w:lang w:val="es-419"/>
+              </w:rPr>
+              <w:t>TARJETA</w:t>
+            </w:r>
+            <w:r>
+              <w:rPr>
+                <w:rFonts w:ascii="Montserrat" w:hAnsi="Montserrat" w:cs="Arial"/>
+                <w:sz w:val="20"/>
+                <w:szCs w:val="20"/>
+                <w:lang w:val="es-419"/>
+              </w:rPr>
+              <w:t>}</w:t>
+            </w:r>
+          </w:p>
+        </w:tc>
+        <w:tc>
+          <w:tcPr>
+            <w:tcW w:w="1985" w:type="dxa"/>
           </w:tcPr>
           <w:p>
             <w:pPr>
@@ -891,7 +910,7 @@
         </w:tc>
         <w:tc>
           <w:tcPr>
-            <w:tcW w:w="1134" w:type="dxa"/>
+            <w:tcW w:w="1417" w:type="dxa"/>
           </w:tcPr>
           <w:p>
             <w:pPr>

</xml_diff>